<commit_message>
API serverseitig intern aufrufen + AppCheck Report
</commit_message>
<xml_diff>
--- a/Immologik_AppCheck_Report.docx
+++ b/Immologik_AppCheck_Report.docx
@@ -27,7 +27,7 @@
           <w:sz w:val="28"/>
           <w:szCs w:val="28"/>
         </w:rPr>
-        <w:t xml:space="preserve">App-Check: Befund-Report &amp; Umsetzungs-Roadmap</w:t>
+        <w:t xml:space="preserve">App-Check v2: Befund-Report &amp; Roadmap (konsolidiert)</w:t>
       </w:r>
     </w:p>
     <w:p>
@@ -40,7 +40,7 @@
           <w:sz w:val="18"/>
           <w:szCs w:val="18"/>
         </w:rPr>
-        <w:t xml:space="preserve">Stand 16.06.2026  ·  NestJS / Next.js Monorepo  ·  Deployment: Git → Coolify → Hetzner</w:t>
+        <w:t xml:space="preserve">Stand 16.06.2026 - NestJS/Next.js Monorepo - Hetzner CPX22 (2 vCPU/4 GB) - Coolify - Git</w:t>
       </w:r>
     </w:p>
     <w:p>
@@ -56,7 +56,7 @@
         <w:spacing w:after="120"/>
       </w:pPr>
       <w:r>
-        <w:t xml:space="preserve">Immologik ist ein funktional gut geschnittenes Wohnungsverwaltungssystem (Objekte, Mieter, Verträge, Dokumente, Zähler-Ablesungen, Nebenkosten) auf solider technischer Basis: NestJS-API mit Prisma/PostgreSQL, Next.js-Frontend, S3/MinIO-Dateiablage, sauberes Modul- und Test-Grundgerüst.</w:t>
+        <w:t xml:space="preserve">Immologik ist ein funktional gut geschnittenes Wohnungsverwaltungssystem (Objekte, Mieter, Vertraege, Dokumente, Zaehler-Ablesungen, Nebenkosten) auf solider technischer Basis. Dieser Report konsolidiert zwei Code-Inspektionen; alle Befunde wurden direkt am Quellcode verifiziert.</w:t>
       </w:r>
     </w:p>
     <w:p>
@@ -64,17 +64,17 @@
         <w:spacing w:after="120"/>
       </w:pPr>
       <w:r>
-        <w:t xml:space="preserve">Der dringendste Handlungsbedarf liegt in der </w:t>
+        <w:t xml:space="preserve">Es bestehen mehrere </w:t>
       </w:r>
       <w:r>
         <w:rPr>
           <w:b/>
           <w:bCs/>
         </w:rPr>
-        <w:t xml:space="preserve">Sicherheit</w:t>
-      </w:r>
-      <w:r>
-        <w:t xml:space="preserve">: Die Anwendung läuft in Produktion ohne aktive App-Authentifizierung (nur ein vorgelagertes Basic-Auth-Gateway), und es gibt keine datenseitige Trennung zwischen Nutzern/Mandanten. Daneben fehlen Betriebsbausteine wie automatisierte Backups mit Zeitplan, Health-Checks und Pagination. Es sind durchweg schließbare Lücken auf gutem Fundament – keine Architekturfehler.</w:t>
+        <w:t xml:space="preserve">kritische, aber schliessbare</w:t>
+      </w:r>
+      <w:r>
+        <w:t xml:space="preserve"> Luecken: ein Status-Werte-Mismatch zwischen Frontend und Backend-DTOs, der das Anlegen von Mietern/Vertraegen blockiert; eine in Produktion nicht aktive App-Authentifizierung ohne Mandantentrennung; ungebremste Datei-Uploads; N+1-Lasten; sowie eine mobil blockierende Navigation. Kein Architekturfehler - gezielte Haertungs- und Korrekturarbeit auf gutem Fundament.</w:t>
       </w:r>
     </w:p>
     <w:p>
@@ -210,7 +210,7 @@
           </w:tcPr>
           <w:p>
             <w:r>
-              <w:t xml:space="preserve">Funktionalität</w:t>
+              <w:t xml:space="preserve">Funktionalitaet</w:t>
             </w:r>
           </w:p>
         </w:tc>
@@ -223,17 +223,17 @@
               <w:bottom w:val="single" w:color="CCCCCC" w:sz="1"/>
               <w:right w:val="single" w:color="CCCCCC" w:sz="1"/>
             </w:tcBorders>
-            <w:shd w:fill="FCF3CF" w:val="clear"/>
-            <w:tcMar>
-              <w:top w:type="dxa" w:w="60"/>
-              <w:left w:type="dxa" w:w="120"/>
-              <w:bottom w:type="dxa" w:w="60"/>
-              <w:right w:type="dxa" w:w="120"/>
-            </w:tcMar>
-          </w:tcPr>
-          <w:p>
-            <w:r>
-              <w:t xml:space="preserve">Gelb</w:t>
+            <w:shd w:fill="F5B7B1" w:val="clear"/>
+            <w:tcMar>
+              <w:top w:type="dxa" w:w="60"/>
+              <w:left w:type="dxa" w:w="120"/>
+              <w:bottom w:type="dxa" w:w="60"/>
+              <w:right w:type="dxa" w:w="120"/>
+            </w:tcMar>
+          </w:tcPr>
+          <w:p>
+            <w:r>
+              <w:t xml:space="preserve">Rot</w:t>
             </w:r>
           </w:p>
         </w:tc>
@@ -255,7 +255,7 @@
           </w:tcPr>
           <w:p>
             <w:r>
-              <w:t xml:space="preserve">Solides MVP mit 6 Modulen; Upload-Endpunkte ohne DTO-Validierung, keine Längenlimits.</w:t>
+              <w:t xml:space="preserve">Status-Werte FE-BE-DTO unvereinbar -&gt; Anlegen von Mietern/Vertraegen schlaegt mit 400 fehl. Zod nur teils eingebunden.</w:t>
             </w:r>
           </w:p>
         </w:tc>
@@ -324,7 +324,7 @@
           </w:tcPr>
           <w:p>
             <w:r>
-              <w:t xml:space="preserve">Produktion läuft im dev-Auth-Modus (nur Basic-Auth-Gateway); keine Mandanten-/Objekt-Isolierung.</w:t>
+              <w:t xml:space="preserve">Produktion im dev-Auth-Modus (nur Basic-Auth); keine Mandanten-/Objekt-Isolierung; Upload ohne Limit.</w:t>
             </w:r>
           </w:p>
         </w:tc>
@@ -361,17 +361,17 @@
               <w:bottom w:val="single" w:color="CCCCCC" w:sz="1"/>
               <w:right w:val="single" w:color="CCCCCC" w:sz="1"/>
             </w:tcBorders>
-            <w:shd w:fill="FCF3CF" w:val="clear"/>
-            <w:tcMar>
-              <w:top w:type="dxa" w:w="60"/>
-              <w:left w:type="dxa" w:w="120"/>
-              <w:bottom w:type="dxa" w:w="60"/>
-              <w:right w:type="dxa" w:w="120"/>
-            </w:tcMar>
-          </w:tcPr>
-          <w:p>
-            <w:r>
-              <w:t xml:space="preserve">Gelb</w:t>
+            <w:shd w:fill="F5B7B1" w:val="clear"/>
+            <w:tcMar>
+              <w:top w:type="dxa" w:w="60"/>
+              <w:left w:type="dxa" w:w="120"/>
+              <w:bottom w:type="dxa" w:w="60"/>
+              <w:right w:type="dxa" w:w="120"/>
+            </w:tcMar>
+          </w:tcPr>
+          <w:p>
+            <w:r>
+              <w:t xml:space="preserve">Rot</w:t>
             </w:r>
           </w:p>
         </w:tc>
@@ -393,7 +393,7 @@
           </w:tcPr>
           <w:p>
             <w:r>
-              <w:t xml:space="preserve">Keine Pagination; Downloads streamen durch die API; sonst saubere Prisma-Queries.</w:t>
+              <w:t xml:space="preserve">N+1 bei Dokumentenliste und Kampagnen-Anlage; keine Pagination; keine Bildkomprimierung.</w:t>
             </w:r>
           </w:p>
         </w:tc>
@@ -417,7 +417,7 @@
           </w:tcPr>
           <w:p>
             <w:r>
-              <w:t xml:space="preserve">Stabilität</w:t>
+              <w:t xml:space="preserve">Stabilitaet</w:t>
             </w:r>
           </w:p>
         </w:tc>
@@ -462,7 +462,7 @@
           </w:tcPr>
           <w:p>
             <w:r>
-              <w:t xml:space="preserve">Kein Health-Endpoint/Exception-Filter; Frontend-Error-Boundaries vorhanden; Logs unstrukturiert.</w:t>
+              <w:t xml:space="preserve">Kein Health-Endpoint/Exception-Filter; FE-Error-Boundaries vorhanden; Logs unstrukturiert; 4 GB RAM eng.</w:t>
             </w:r>
           </w:p>
         </w:tc>
@@ -531,7 +531,7 @@
           </w:tcPr>
           <w:p>
             <w:r>
-              <w:t xml:space="preserve">Backup-Setup vorhanden, aber kein automatischer Zeitplan; Restore ungetestet.</w:t>
+              <w:t xml:space="preserve">Backup-Setup vorhanden, aber kein erprobter Restore; DSGVO-Datensparsamkeit offen.</w:t>
             </w:r>
           </w:p>
         </w:tc>
@@ -568,17 +568,17 @@
               <w:bottom w:val="single" w:color="CCCCCC" w:sz="1"/>
               <w:right w:val="single" w:color="CCCCCC" w:sz="1"/>
             </w:tcBorders>
-            <w:shd w:fill="FCF3CF" w:val="clear"/>
-            <w:tcMar>
-              <w:top w:type="dxa" w:w="60"/>
-              <w:left w:type="dxa" w:w="120"/>
-              <w:bottom w:type="dxa" w:w="60"/>
-              <w:right w:type="dxa" w:w="120"/>
-            </w:tcMar>
-          </w:tcPr>
-          <w:p>
-            <w:r>
-              <w:t xml:space="preserve">Gelb</w:t>
+            <w:shd w:fill="F5B7B1" w:val="clear"/>
+            <w:tcMar>
+              <w:top w:type="dxa" w:w="60"/>
+              <w:left w:type="dxa" w:w="120"/>
+              <w:bottom w:type="dxa" w:w="60"/>
+              <w:right w:type="dxa" w:w="120"/>
+            </w:tcMar>
+          </w:tcPr>
+          <w:p>
+            <w:r>
+              <w:t xml:space="preserve">Rot</w:t>
             </w:r>
           </w:p>
         </w:tc>
@@ -600,7 +600,7 @@
           </w:tcPr>
           <w:p>
             <w:r>
-              <w:t xml:space="preserve">Nur teilweise responsiv; wenige Ladezustände; generische Fehlermeldungen.</w:t>
+              <w:t xml:space="preserve">Sidebar blockiert mobile Ansicht; wenige Ladezustaende; generische Fehlermeldungen.</w:t>
             </w:r>
           </w:p>
         </w:tc>
@@ -618,7 +618,7 @@
           <w:sz w:val="16"/>
           <w:szCs w:val="16"/>
         </w:rPr>
-        <w:t xml:space="preserve">Bewertung: Rot = vor Echtbetrieb beheben · Gelb = zeitnah · Grün = solide.</w:t>
+        <w:t xml:space="preserve">Rot = vor Echtbetrieb beheben - Gelb = zeitnah - Gruen = mittelfristig/Architektur.</w:t>
       </w:r>
     </w:p>
     <w:p>
@@ -639,7 +639,22 @@
         <w:pStyle w:val="Heading2"/>
       </w:pPr>
       <w:r>
-        <w:t xml:space="preserve">2.1 Funktionalität</w:t>
+        <w:t xml:space="preserve">2.1 Funktionalitaet</w:t>
+      </w:r>
+    </w:p>
+    <w:p>
+      <w:pPr>
+        <w:spacing w:after="60" w:before="160"/>
+      </w:pPr>
+      <w:r>
+        <w:rPr>
+          <w:b/>
+          <w:bCs/>
+          <w:color w:val="333333"/>
+          <w:sz w:val="22"/>
+          <w:szCs w:val="22"/>
+        </w:rPr>
+        <w:t xml:space="preserve">Status-Werte Frontend &lt;-&gt; Backend-DTO unvereinbar (Kritisch)</w:t>
       </w:r>
     </w:p>
     <w:p>
@@ -652,14 +667,7 @@
         <w:spacing w:after="60"/>
       </w:pPr>
       <w:r>
-        <w:rPr>
-          <w:b/>
-          <w:bCs/>
-        </w:rPr>
-        <w:t xml:space="preserve">Positiv:</w:t>
-      </w:r>
-      <w:r>
-        <w:t xml:space="preserve"> Sechs durchgängige Module; zentrale Zod-Schemas im Frontend; globale ValidationPipe (whitelist, forbidNonWhitelisted, transform) im Backend; 22 Test-Dateien vorhanden.</w:t>
+        <w:t xml:space="preserve">Mieter-Formular bietet Aktiv/Ausstehend/Beendet, Vertrag-Formular Aktiv/In Pruefung/Laeuft aus.</w:t>
       </w:r>
     </w:p>
     <w:p>
@@ -672,7 +680,7 @@
         <w:spacing w:after="60"/>
       </w:pPr>
       <w:r>
-        <w:t xml:space="preserve">Die Dokument-Endpunkte (Upload, Metadaten) lesen Body-Felder einzeln über @Body() ohne DTO und umgehen damit die Validierungs-Pipe. Empfehlung: DTOs einführen.</w:t>
+        <w:t xml:space="preserve">Die DTOs verlangen aber englische Werte: create-tenant.dto.ts @IsIn(['active','inactive']), create-contract.dto.ts @IsIn(['active','inactive','terminated']).</w:t>
       </w:r>
     </w:p>
     <w:p>
@@ -685,7 +693,29 @@
         <w:spacing w:after="60"/>
       </w:pPr>
       <w:r>
-        <w:t xml:space="preserve">Keine Maximallängen auf Textfeldern (DB-String ohne Limit, kein Zod-max). Sehr lange Eingaben werden ungeprüft gespeichert.</w:t>
+        <w:rPr>
+          <w:b/>
+          <w:bCs/>
+        </w:rPr>
+        <w:t xml:space="preserve">Folge:</w:t>
+      </w:r>
+      <w:r>
+        <w:t xml:space="preserve"> Jede Uebermittlung mit den deutschen Standardwerten scheitert an der ValidationPipe (400) und erscheint im UI nur als generischer Speicherfehler. Verifiziert.</w:t>
+      </w:r>
+    </w:p>
+    <w:p>
+      <w:pPr>
+        <w:spacing w:after="60" w:before="160"/>
+      </w:pPr>
+      <w:r>
+        <w:rPr>
+          <w:b/>
+          <w:bCs/>
+          <w:color w:val="333333"/>
+          <w:sz w:val="22"/>
+          <w:szCs w:val="22"/>
+        </w:rPr>
+        <w:t xml:space="preserve">Zod-Schemas definiert, aber kaum eingebunden (Mittel)</w:t>
       </w:r>
     </w:p>
     <w:p>
@@ -698,7 +728,22 @@
         <w:spacing w:after="60"/>
       </w:pPr>
       <w:r>
-        <w:t xml:space="preserve">Nebenkosten-Arbeitsstand wird als JSON-Blob (positions/units) gespeichert – flexibel, aber schwer validier- und auswertbar.</w:t>
+        <w:t xml:space="preserve">schemas.ts enthaelt saubere Schemas; im Code wird jedoch nur objectSchema (new-object-form.tsx) genutzt. Keine clientseitige Format-/Plausibilitaetspruefung -&gt; Fehler fallen erst spaet im Backend auf.</w:t>
+      </w:r>
+    </w:p>
+    <w:p>
+      <w:pPr>
+        <w:spacing w:after="60" w:before="160"/>
+      </w:pPr>
+      <w:r>
+        <w:rPr>
+          <w:b/>
+          <w:bCs/>
+          <w:color w:val="333333"/>
+          <w:sz w:val="22"/>
+          <w:szCs w:val="22"/>
+        </w:rPr>
+        <w:t xml:space="preserve">Datumsformate &amp; DB-Typ (Mittel)</w:t>
       </w:r>
     </w:p>
     <w:p>
@@ -711,15 +756,22 @@
         <w:spacing w:after="60"/>
       </w:pPr>
       <w:r>
-        <w:t xml:space="preserve">Sonderzeichen/XSS: React escaped Ausgaben automatisch, kein dangerouslySetInnerHTML gefunden – unkritisch.</w:t>
-      </w:r>
-    </w:p>
-    <w:p>
-      <w:pPr>
-        <w:pStyle w:val="Heading2"/>
-      </w:pPr>
-      <w:r>
-        <w:t xml:space="preserve">2.2 Sicherheit</w:t>
+        <w:t xml:space="preserve">DTOs erwarten ISO 8601 (@IsDateString), Seeds nutzen deutsche Strings (01.04.2024); startDate/endDate sind im Schema String statt DateTime -&gt; Probleme bei Sortierung/Filterung. Textfelder ohne durchgaengige Maximallaengen.</w:t>
+      </w:r>
+    </w:p>
+    <w:p>
+      <w:pPr>
+        <w:spacing w:after="60" w:before="160"/>
+      </w:pPr>
+      <w:r>
+        <w:rPr>
+          <w:b/>
+          <w:bCs/>
+          <w:color w:val="333333"/>
+          <w:sz w:val="22"/>
+          <w:szCs w:val="22"/>
+        </w:rPr>
+        <w:t xml:space="preserve">Positiv / Edge Cases</w:t>
       </w:r>
     </w:p>
     <w:p>
@@ -732,14 +784,30 @@
         <w:spacing w:after="60"/>
       </w:pPr>
       <w:r>
+        <w:t xml:space="preserve">Sechs durchgaengige Module; globale ValidationPipe (whitelist, forbidNonWhitelisted, transform); 22 Test-Dateien. Leere Listen sauber abgefangen. Dateinamen-Bereinigung filtert ungueltige Zeichen. XSS in normalen Ausgaben durch React-Escaping unkritisch (Ausnahme: Upload).</w:t>
+      </w:r>
+    </w:p>
+    <w:p>
+      <w:pPr>
+        <w:pStyle w:val="Heading2"/>
+      </w:pPr>
+      <w:r>
+        <w:t xml:space="preserve">2.2 Sicherheit</w:t>
+      </w:r>
+    </w:p>
+    <w:p>
+      <w:pPr>
+        <w:spacing w:after="60" w:before="160"/>
+      </w:pPr>
+      <w:r>
         <w:rPr>
           <w:b/>
           <w:bCs/>
+          <w:color w:val="333333"/>
+          <w:sz w:val="22"/>
+          <w:szCs w:val="22"/>
         </w:rPr>
-        <w:t xml:space="preserve">Auth-Code solide:</w:t>
-      </w:r>
-      <w:r>
-        <w:t xml:space="preserve"> Der Entra-(Azure-AD-)Guard ist sauber implementiert (RS256, JWKS-Cache, Prüfung von iss/aud/exp/nbf, Signaturverifikation).</w:t>
+        <w:t xml:space="preserve">Authentifizierung in Produktion nicht aktiv (Kritisch)</w:t>
       </w:r>
     </w:p>
     <w:p>
@@ -752,14 +820,7 @@
         <w:spacing w:after="60"/>
       </w:pPr>
       <w:r>
-        <w:rPr>
-          <w:b/>
-          <w:bCs/>
-        </w:rPr>
-        <w:t xml:space="preserve">Kritisch – Auth nicht aktiv:</w:t>
-      </w:r>
-      <w:r>
-        <w:t xml:space="preserve"> Das Produktiv-Deployment setzt AUTH_MODE=dev (siehe .env.coolify.example); der Guard lässt dann alle Anfragen durch. Schutz besteht nur durch das Caddy-Basic-Auth-Gateway.</w:t>
+        <w:t xml:space="preserve">Der Entra-Guard (auth.guard.ts) ist sauber implementiert (RS256, JWKS-Cache, iss/aud/exp/nbf). Aber: Das Frontend integriert keine Auth-Bibliothek (MSAL/NextAuth) und sendet keinen Authorization-Header.</w:t>
       </w:r>
     </w:p>
     <w:p>
@@ -776,10 +837,25 @@
           <w:b/>
           <w:bCs/>
         </w:rPr>
-        <w:t xml:space="preserve">Auth-Schleife offen:</w:t>
-      </w:r>
-      <w:r>
-        <w:t xml:space="preserve"> Das Frontend sendet keinen Bearer-Token (kein MSAL/Token-Acquisition). Im entra-Modus würde das Frontend daher aktuell scheitern – deshalb der dev-Modus. Diese Lücke muss geschlossen werden.</w:t>
+        <w:t xml:space="preserve">Behelf:</w:t>
+      </w:r>
+      <w:r>
+        <w:t xml:space="preserve"> Backend laeuft mit AUTH_MODE=dev; Schutz nur durch eine Caddy-Basic-Auth-Vorschaltseite - kein vollwertiges Identitaetsmanagement.</w:t>
+      </w:r>
+    </w:p>
+    <w:p>
+      <w:pPr>
+        <w:spacing w:after="60" w:before="160"/>
+      </w:pPr>
+      <w:r>
+        <w:rPr>
+          <w:b/>
+          <w:bCs/>
+          <w:color w:val="333333"/>
+          <w:sz w:val="22"/>
+          <w:szCs w:val="22"/>
+        </w:rPr>
+        <w:t xml:space="preserve">Keine Autorisierung / Mandantentrennung (Kritisch)</w:t>
       </w:r>
     </w:p>
     <w:p>
@@ -792,14 +868,7 @@
         <w:spacing w:after="60"/>
       </w:pPr>
       <w:r>
-        <w:rPr>
-          <w:b/>
-          <w:bCs/>
-        </w:rPr>
-        <w:t xml:space="preserve">Keine Autorisierung A↔B:</w:t>
-      </w:r>
-      <w:r>
-        <w:t xml:space="preserve"> Das Schema kennt Tenant/User mit tenantId, aber Objekte, Dokumente, Mieter etc. tragen keinen tenantId/Owner. Es gibt kein Query-Scoping – jeder eingeloggte Nutzer sähe alle Daten. Bei Einzelnutzung tolerierbar, bei mehreren Nutzern/Mandanten ein Risiko.</w:t>
+        <w:t xml:space="preserve">Schema kennt Tenant &amp; User (mit tenantId), aber kein operatives Modell (PropertyObject, RentUnit, Mieter, Vertrag, Document, Meter, UtilityStatement) hat eine Mandanten-Beziehung; keine Autorisierungspruefung in Controllern.</w:t>
       </w:r>
     </w:p>
     <w:p>
@@ -816,10 +885,25 @@
           <w:b/>
           <w:bCs/>
         </w:rPr>
-        <w:t xml:space="preserve">SQL-Injection:</w:t>
-      </w:r>
-      <w:r>
-        <w:t xml:space="preserve"> Durch Prisma (parametrisiert) ausgeschlossen; kein Raw-SQL gefunden.</w:t>
+        <w:t xml:space="preserve">Folge:</w:t>
+      </w:r>
+      <w:r>
+        <w:t xml:space="preserve"> Alle Immobiliendaten liegen global ungekapselt - ein Nutzer von Mandant A koennte Daten von Mandant B lesen/aendern.</w:t>
+      </w:r>
+    </w:p>
+    <w:p>
+      <w:pPr>
+        <w:spacing w:after="60" w:before="160"/>
+      </w:pPr>
+      <w:r>
+        <w:rPr>
+          <w:b/>
+          <w:bCs/>
+          <w:color w:val="333333"/>
+          <w:sz w:val="22"/>
+          <w:szCs w:val="22"/>
+        </w:rPr>
+        <w:t xml:space="preserve">Unbeschraenkter File-Upload (Hoch)</w:t>
       </w:r>
     </w:p>
     <w:p>
@@ -832,14 +916,22 @@
         <w:spacing w:after="60"/>
       </w:pPr>
       <w:r>
+        <w:t xml:space="preserve">documents.controller.ts nimmt Uploads ueber memoryStorage ohne Groessenlimit und ohne MIME-Filter entgegen. Folge: OOM-Absturz bei grossen Dateien auf der 4-GB-VM; Stored XSS via HTML/SVG mit eingebettetem JavaScript. Verifiziert.</w:t>
+      </w:r>
+    </w:p>
+    <w:p>
+      <w:pPr>
+        <w:spacing w:after="60" w:before="160"/>
+      </w:pPr>
+      <w:r>
         <w:rPr>
           <w:b/>
           <w:bCs/>
+          <w:color w:val="333333"/>
+          <w:sz w:val="22"/>
+          <w:szCs w:val="22"/>
         </w:rPr>
-        <w:t xml:space="preserve">Upload ungebremst:</w:t>
-      </w:r>
-      <w:r>
-        <w:t xml:space="preserve"> memoryStorage ohne Größen- oder MIME-Limit → DoS-Risiko (große Datei = OOM) und beliebige Dateitypen.</w:t>
+        <w:t xml:space="preserve">Positiv: SQL-Injection &amp; HTTPS</w:t>
       </w:r>
     </w:p>
     <w:p>
@@ -852,22 +944,30 @@
         <w:spacing w:after="60"/>
       </w:pPr>
       <w:r>
+        <w:t xml:space="preserve">SQL-Injection durch Prisma (parametrisiert) ausgeschlossen. HTTPS ueber Coolify/Traefik/Caddy + Let's Encrypt verfuegbar, sobald eine echte Domain konfiguriert ist. Rate-Limiting nur fuer Token-Endpunkte.</w:t>
+      </w:r>
+    </w:p>
+    <w:p>
+      <w:pPr>
+        <w:pStyle w:val="Heading2"/>
+      </w:pPr>
+      <w:r>
+        <w:t xml:space="preserve">2.3 Performance</w:t>
+      </w:r>
+    </w:p>
+    <w:p>
+      <w:pPr>
+        <w:spacing w:after="60" w:before="160"/>
+      </w:pPr>
+      <w:r>
         <w:rPr>
           <w:b/>
           <w:bCs/>
+          <w:color w:val="333333"/>
+          <w:sz w:val="22"/>
+          <w:szCs w:val="22"/>
         </w:rPr>
-        <w:t xml:space="preserve">HTTPS/Secrets:</w:t>
-      </w:r>
-      <w:r>
-        <w:t xml:space="preserve"> Caddy lauscht auf :8080 (HTTP); TLS muss extern (Coolify/Reverse-Proxy + Domain) terminiert werden – im Repo nicht abgesichert. Beispiel-Passwörter sind „change-me“. Rate-Limiting nur für Token-Endpunkte, nicht für die übrige API.</w:t>
-      </w:r>
-    </w:p>
-    <w:p>
-      <w:pPr>
-        <w:pStyle w:val="Heading2"/>
-      </w:pPr>
-      <w:r>
-        <w:t xml:space="preserve">2.3 Performance</w:t>
+        <w:t xml:space="preserve">N+1 bei der Dokumentenliste (Kritisch)</w:t>
       </w:r>
     </w:p>
     <w:p>
@@ -880,14 +980,22 @@
         <w:spacing w:after="60"/>
       </w:pPr>
       <w:r>
+        <w:t xml:space="preserve">findAll -&gt; mapWithUrl pro Dokument: je Dokument ein minio.fileExists (HEAD) und ein getPresignedUrl. Bei 100 Dokumenten bis zu ~200 MinIO-Aufrufe pro Listenabruf. Verifiziert.</w:t>
+      </w:r>
+    </w:p>
+    <w:p>
+      <w:pPr>
+        <w:spacing w:after="60" w:before="160"/>
+      </w:pPr>
+      <w:r>
         <w:rPr>
           <w:b/>
           <w:bCs/>
+          <w:color w:val="333333"/>
+          <w:sz w:val="22"/>
+          <w:szCs w:val="22"/>
         </w:rPr>
-        <w:t xml:space="preserve">Positiv:</w:t>
-      </w:r>
-      <w:r>
-        <w:t xml:space="preserve"> Relationen werden per Prisma-include eager geladen – keine offensichtlichen N+1-Probleme. FK-Indizes vorhanden.</w:t>
+        <w:t xml:space="preserve">N+1 bei der Kampagnen-Anlage (Mittel)</w:t>
       </w:r>
     </w:p>
     <w:p>
@@ -900,14 +1008,22 @@
         <w:spacing w:after="60"/>
       </w:pPr>
       <w:r>
+        <w:t xml:space="preserve">createCampaign iteriert ueber aktive Mieter und fuehrt je Mieter ensureStandardMeters (mehrere Upserts) + readingAccess-Upsert sequenziell aus. Bei 30 Einheiten viele Dutzend einzelne DB-Abfragen pro Request. Verifiziert.</w:t>
+      </w:r>
+    </w:p>
+    <w:p>
+      <w:pPr>
+        <w:spacing w:after="60" w:before="160"/>
+      </w:pPr>
+      <w:r>
         <w:rPr>
           <w:b/>
           <w:bCs/>
+          <w:color w:val="333333"/>
+          <w:sz w:val="22"/>
+          <w:szCs w:val="22"/>
         </w:rPr>
-        <w:t xml:space="preserve">Keine Pagination:</w:t>
-      </w:r>
-      <w:r>
-        <w:t xml:space="preserve"> Alle Listen (findMany) laden ohne take/skip den kompletten Datenbestand. Bei wachsender Datenmenge steigen Antwortzeit und Speicher.</w:t>
+        <w:t xml:space="preserve">Keine Pagination / keine Bildkomprimierung (Mittel)</w:t>
       </w:r>
     </w:p>
     <w:p>
@@ -920,7 +1036,7 @@
         <w:spacing w:after="60"/>
       </w:pPr>
       <w:r>
-        <w:t xml:space="preserve">getNextDisplayId lädt alle Objekte, um die höchste Nummer zu finden – sollte über Aggregat/ORDER BY laufen.</w:t>
+        <w:t xml:space="preserve">Alle List-Endpunkte laden per findMany ohne take/skip den kompletten Bestand.</w:t>
       </w:r>
     </w:p>
     <w:p>
@@ -933,7 +1049,7 @@
         <w:spacing w:after="60"/>
       </w:pPr>
       <w:r>
-        <w:t xml:space="preserve">Datei-Downloads streamen durch die API (getContent) statt per presigned S3-URL – die API wird zum Flaschenhals. (getDownloadUrl existiert bereits als Basis.)</w:t>
+        <w:t xml:space="preserve">Bild-Uploads (z. B. Zaehlerfotos) werden ohne Skalierung/Komprimierung in S3 abgelegt. Hinweis: sharp ist aktuell NICHT installiert (Korrektur ggue. dem 2. Report) und muesste erst ergaenzt werden.</w:t>
       </w:r>
     </w:p>
     <w:p>
@@ -946,15 +1062,7 @@
         <w:spacing w:after="60"/>
       </w:pPr>
       <w:r>
-        <w:t xml:space="preserve">Frontend nutzt durchgehend cache: no-store – kein Client-Caching.</w:t>
-      </w:r>
-    </w:p>
-    <w:p>
-      <w:pPr>
-        <w:pStyle w:val="Heading2"/>
-      </w:pPr>
-      <w:r>
-        <w:t xml:space="preserve">2.4 Stabilität</w:t>
+        <w:t xml:space="preserve">Datei-Downloads streamen durch die API statt per Presigned-URL; getNextDisplayId laedt alle Objekte zur Maximumsuche; Frontend nutzt durchgehend cache no-store.</w:t>
       </w:r>
     </w:p>
     <w:p>
@@ -967,7 +1075,22 @@
         <w:spacing w:after="60"/>
       </w:pPr>
       <w:r>
-        <w:t xml:space="preserve">Kein /health-Endpoint und kein @nestjs/terminus; der Compose-Healthcheck deckt nur Postgres ab, nicht API/Web. Coolify erkennt eine hängende API daher nicht.</w:t>
+        <w:rPr>
+          <w:b/>
+          <w:bCs/>
+        </w:rPr>
+        <w:t xml:space="preserve">Positiv:</w:t>
+      </w:r>
+      <w:r>
+        <w:t xml:space="preserve"> Relationen werden per Prisma-include geladen; FK-Indizes vorhanden.</w:t>
+      </w:r>
+    </w:p>
+    <w:p>
+      <w:pPr>
+        <w:pStyle w:val="Heading2"/>
+      </w:pPr>
+      <w:r>
+        <w:t xml:space="preserve">2.4 Stabilitaet</w:t>
       </w:r>
     </w:p>
     <w:p>
@@ -980,7 +1103,7 @@
         <w:spacing w:after="60"/>
       </w:pPr>
       <w:r>
-        <w:t xml:space="preserve">Kein globaler Exception-Filter – Fehlerantworten sind uneinheitlich.</w:t>
+        <w:t xml:space="preserve">Kein /health-Endpoint und kein @nestjs/terminus; Compose-Healthcheck deckt nur Postgres ab, nicht API/Web.</w:t>
       </w:r>
     </w:p>
     <w:p>
@@ -993,14 +1116,7 @@
         <w:spacing w:after="60"/>
       </w:pPr>
       <w:r>
-        <w:rPr>
-          <w:b/>
-          <w:bCs/>
-        </w:rPr>
-        <w:t xml:space="preserve">Positiv:</w:t>
-      </w:r>
-      <w:r>
-        <w:t xml:space="preserve"> Frontend hat Error-Boundaries pro Route (error.tsx) und global-error.tsx.</w:t>
+        <w:t xml:space="preserve">Kein globaler Exception-Filter; Logs unstrukturiert (kein JSON/Pino, keine Korrelations-IDs) - fuer Coolify nutzbar, aber fuer professionelle Auswertung duenn.</w:t>
       </w:r>
     </w:p>
     <w:p>
@@ -1013,7 +1129,7 @@
         <w:spacing w:after="60"/>
       </w:pPr>
       <w:r>
-        <w:t xml:space="preserve">Logging über den NestJS-Logger, aber unstrukturiert (kein JSON, keine Korrelations-IDs, keine zentrale Aggregation) – Auswertbarkeit begrenzt.</w:t>
+        <w:t xml:space="preserve">RAM-Enge: Auf der CPX22 (4 GB) laufen Postgres, MinIO, API, Web und Coolify parallel. Builds sind via GitHub Actions/GHCR ausgelagert; die Laufzeit-RAM-Auslastung sollte ueberwacht werden.</w:t>
       </w:r>
     </w:p>
     <w:p>
@@ -1026,15 +1142,14 @@
         <w:spacing w:after="60"/>
       </w:pPr>
       <w:r>
-        <w:t xml:space="preserve">restart: unless-stopped sorgt für Container-Neustarts; ohne API-Healthcheck bleibt der Selbstheilungseffekt aber unvollständig.</w:t>
-      </w:r>
-    </w:p>
-    <w:p>
-      <w:pPr>
-        <w:pStyle w:val="Heading2"/>
-      </w:pPr>
-      <w:r>
-        <w:t xml:space="preserve">2.5 Datensicherheit &amp; Betrieb</w:t>
+        <w:rPr>
+          <w:b/>
+          <w:bCs/>
+        </w:rPr>
+        <w:t xml:space="preserve">Positiv:</w:t>
+      </w:r>
+      <w:r>
+        <w:t xml:space="preserve"> Frontend hat Error-Boundaries pro Route (error.tsx) und global-error.tsx; restart unless-stopped sorgt fuer Neustarts.</w:t>
       </w:r>
     </w:p>
     <w:p>
@@ -1051,10 +1166,18 @@
           <w:b/>
           <w:bCs/>
         </w:rPr>
-        <w:t xml:space="preserve">Positiv:</w:t>
-      </w:r>
-      <w:r>
-        <w:t xml:space="preserve"> Durchdachter Backup-Service (pg_dump + MinIO-tar → rclone in die Cloud, Retention konfigurierbar).</w:t>
+        <w:t xml:space="preserve">Unvollstaendige FE-Fehlerbehandlung:</w:t>
+      </w:r>
+      <w:r>
+        <w:t xml:space="preserve"> catch-Bloecke reduzieren oft auf statische Texte; Backend-Validierungsfehler werden dem Nutzer nicht angezeigt.</w:t>
+      </w:r>
+    </w:p>
+    <w:p>
+      <w:pPr>
+        <w:pStyle w:val="Heading2"/>
+      </w:pPr>
+      <w:r>
+        <w:t xml:space="preserve">2.5 Datensicherheit &amp; Betrieb</w:t>
       </w:r>
     </w:p>
     <w:p>
@@ -1067,7 +1190,14 @@
         <w:spacing w:after="60"/>
       </w:pPr>
       <w:r>
-        <w:t xml:space="preserve">Der Backup-Container hat restart: no und keinen Scheduler – er läuft nur manuell. Es fehlt ein automatischer Zeitplan (z. B. Coolify-Cron).</w:t>
+        <w:rPr>
+          <w:b/>
+          <w:bCs/>
+        </w:rPr>
+        <w:t xml:space="preserve">Positiv:</w:t>
+      </w:r>
+      <w:r>
+        <w:t xml:space="preserve"> Durchdachtes rclone-Cloud-Backup (PostgreSQL + MinIO) in docker-compose konfiguriert; SSH per Key-Auth, Coolify hinter Basic-Auth-Gateway.</w:t>
       </w:r>
     </w:p>
     <w:p>
@@ -1080,7 +1210,14 @@
         <w:spacing w:after="60"/>
       </w:pPr>
       <w:r>
-        <w:t xml:space="preserve">Restore-Skript (PowerShell) vorhanden, ein dokumentierter Restore-Test fehlt jedoch – Backups sind nur so gut wie ihre nachgewiesene Wiederherstellung.</w:t>
+        <w:rPr>
+          <w:b/>
+          <w:bCs/>
+        </w:rPr>
+        <w:t xml:space="preserve">Offen:</w:t>
+      </w:r>
+      <w:r>
+        <w:t xml:space="preserve"> Der Backup-Container hat keinen Scheduler (restart no) - Lauf nur manuell; ein automatisierter Restore-/Wiederherstellungstest fehlt.</w:t>
       </w:r>
     </w:p>
     <w:p>
@@ -1093,7 +1230,14 @@
         <w:spacing w:after="60"/>
       </w:pPr>
       <w:r>
-        <w:t xml:space="preserve">Server-/Zugriffsverwaltung liegt außerhalb des Repos: SSH-Key-Hygiene, Coolify-Benutzerrollen und das Nicht-Exponieren der MinIO-Konsole sollten dokumentiert werden.</w:t>
+        <w:rPr>
+          <w:b/>
+          <w:bCs/>
+        </w:rPr>
+        <w:t xml:space="preserve">DSGVO:</w:t>
+      </w:r>
+      <w:r>
+        <w:t xml:space="preserve"> Datensparsamkeit pruefen - Verschluesselung bzw. Loeschung/Anonymisierung personenbezogener Mieterdaten nach Vertragsende ist nicht geregelt.</w:t>
       </w:r>
     </w:p>
     <w:p>
@@ -1102,6 +1246,21 @@
       </w:pPr>
       <w:r>
         <w:t xml:space="preserve">2.6 UX &amp; Mobile</w:t>
+      </w:r>
+    </w:p>
+    <w:p>
+      <w:pPr>
+        <w:spacing w:after="60" w:before="160"/>
+      </w:pPr>
+      <w:r>
+        <w:rPr>
+          <w:b/>
+          <w:bCs/>
+          <w:color w:val="333333"/>
+          <w:sz w:val="22"/>
+          <w:szCs w:val="22"/>
+        </w:rPr>
+        <w:t xml:space="preserve">Sidebar blockiert die mobile Ansicht (Kritisch)</w:t>
       </w:r>
     </w:p>
     <w:p>
@@ -1114,7 +1273,7 @@
         <w:spacing w:after="60"/>
       </w:pPr>
       <w:r>
-        <w:t xml:space="preserve">Responsive-Breakpoints (sm/md/lg) nur in wenigen Komponenten – die Mobil-Tauglichkeit ist lückenhaft. Besonders das öffentliche Mieter-Ableseformular sollte mobil getestet werden.</w:t>
+        <w:t xml:space="preserve">admin-shell.tsx nutzt grid-cols-1 lg:grid-cols-[260px_minmax(0,1fr)]; die Sidebar hat keine responsive Ausblendung (kein hidden lg:block). Auf Mobilgeraeten wird die Navigation dauerhaft oberhalb des Inhalts gerendert - Nutzer muessen weit scrollen. Verifiziert.</w:t>
       </w:r>
     </w:p>
     <w:p>
@@ -1127,7 +1286,7 @@
         <w:spacing w:after="60"/>
       </w:pPr>
       <w:r>
-        <w:t xml:space="preserve">Nur vereinzelt Ladezustände/Skeletons – die meisten Listen zeigen während des Ladens keinen Indikator.</w:t>
+        <w:t xml:space="preserve">Nur vereinzelt Ladezustaende/Skeletons; Fehlermeldungen teils generisch.</w:t>
       </w:r>
     </w:p>
     <w:p>
@@ -1140,7 +1299,14 @@
         <w:spacing w:after="60"/>
       </w:pPr>
       <w:r>
-        <w:t xml:space="preserve">Fehlermeldungen sind teils generisch („Die Daten konnten nicht geladen werden“) – wenig hilfreich zur Eingrenzung.</w:t>
+        <w:rPr>
+          <w:b/>
+          <w:bCs/>
+        </w:rPr>
+        <w:t xml:space="preserve">Nebenkosten-Hybridspeicherung:</w:t>
+      </w:r>
+      <w:r>
+        <w:t xml:space="preserve"> Daten werden initial per API geladen, Aenderungen aber synchron im localStorage gehalten und nur debounced mit der API synchronisiert -&gt; bei Sync-Fehlern/Mehrgeraete-Nutzung drohen Datenkonflikte.</w:t>
       </w:r>
     </w:p>
     <w:p>
@@ -1153,7 +1319,95 @@
         <w:pStyle w:val="Heading1"/>
       </w:pPr>
       <w:r>
-        <w:t xml:space="preserve">3. Roadmap</w:t>
+        <w:t xml:space="preserve">3. Erweiterte Kontrollpunkte (Empfehlung)</w:t>
+      </w:r>
+    </w:p>
+    <w:p>
+      <w:pPr>
+        <w:pStyle w:val="ListParagraph"/>
+        <w:numPr>
+          <w:ilvl w:val="0"/>
+          <w:numId w:val="2"/>
+        </w:numPr>
+        <w:spacing w:after="60"/>
+      </w:pPr>
+      <w:r>
+        <w:rPr>
+          <w:b/>
+          <w:bCs/>
+        </w:rPr>
+        <w:t xml:space="preserve">DevOps/Deployment-Parity:</w:t>
+      </w:r>
+      <w:r>
+        <w:t xml:space="preserve"> NEXT_PUBLIC_-Variablen werden zur Build-Zeit fest in den Client-Code eingebrannt - Aenderungen in Coolify erfordern einen Image-Rebuild; im CI/CD beruecksichtigen.</w:t>
+      </w:r>
+    </w:p>
+    <w:p>
+      <w:pPr>
+        <w:pStyle w:val="ListParagraph"/>
+        <w:numPr>
+          <w:ilvl w:val="0"/>
+          <w:numId w:val="2"/>
+        </w:numPr>
+        <w:spacing w:after="60"/>
+      </w:pPr>
+      <w:r>
+        <w:rPr>
+          <w:b/>
+          <w:bCs/>
+        </w:rPr>
+        <w:t xml:space="preserve">Monitoring:</w:t>
+      </w:r>
+      <w:r>
+        <w:t xml:space="preserve"> echtes Uptime-Monitoring (z. B. Uptime Kuma) fuer /api/v1/health und Frontend.</w:t>
+      </w:r>
+    </w:p>
+    <w:p>
+      <w:pPr>
+        <w:pStyle w:val="ListParagraph"/>
+        <w:numPr>
+          <w:ilvl w:val="0"/>
+          <w:numId w:val="2"/>
+        </w:numPr>
+        <w:spacing w:after="60"/>
+      </w:pPr>
+      <w:r>
+        <w:rPr>
+          <w:b/>
+          <w:bCs/>
+        </w:rPr>
+        <w:t xml:space="preserve">DSGVO &amp; Datenschutz:</w:t>
+      </w:r>
+      <w:r>
+        <w:t xml:space="preserve"> Datensparsamkeit, Verschluesselung und Loesch-/Anonymisierungskonzept fuer Mieterdaten.</w:t>
+      </w:r>
+    </w:p>
+    <w:p>
+      <w:pPr>
+        <w:pStyle w:val="ListParagraph"/>
+        <w:numPr>
+          <w:ilvl w:val="0"/>
+          <w:numId w:val="2"/>
+        </w:numPr>
+        <w:spacing w:after="60"/>
+      </w:pPr>
+      <w:r>
+        <w:rPr>
+          <w:b/>
+          <w:bCs/>
+        </w:rPr>
+        <w:t xml:space="preserve">Mandanten-Sicherheit:</w:t>
+      </w:r>
+      <w:r>
+        <w:t xml:space="preserve"> Architekturentscheidung logische Trennung (Prisma-Filter je Mandanten-ID) vs. physische Trennung (DB je Mandant).</w:t>
+      </w:r>
+    </w:p>
+    <w:p>
+      <w:pPr>
+        <w:pStyle w:val="Heading1"/>
+      </w:pPr>
+      <w:r>
+        <w:t xml:space="preserve">4. Roadmap</w:t>
       </w:r>
     </w:p>
     <w:p>
@@ -1161,7 +1415,7 @@
         <w:spacing w:after="120"/>
       </w:pPr>
       <w:r>
-        <w:t xml:space="preserve">Priorisiert nach Risiko und Aufwand. P0 = vor verlässlichem Echtbetrieb, P1 = kurzfristig, P2 = mittelfristig.</w:t>
+        <w:t xml:space="preserve">Priorisiert nach Risiko und Aufwand. P0 = vor verlaesslichem Echtbetrieb, P1 = kurzfristig, P2 = mittelfristig/Architektur. Aufwand grob fuer einen einzelnen Entwickler.</w:t>
       </w:r>
     </w:p>
     <w:p>
@@ -1246,7 +1500,7 @@
                 <w:bCs/>
                 <w:color w:val="FFFFFF"/>
               </w:rPr>
-              <w:t xml:space="preserve">Maßnahme</w:t>
+              <w:t xml:space="preserve">Massnahme</w:t>
             </w:r>
           </w:p>
         </w:tc>
@@ -1349,7 +1603,7 @@
           </w:tcPr>
           <w:p>
             <w:r>
-              <w:t xml:space="preserve">App-Authentifizierung schließen: MSAL/Token im Frontend + AUTH_MODE=entra in Produktion (dev-Modus abschalten).</w:t>
+              <w:t xml:space="preserve">Status-Enums in DTOs (create-tenant/create-contract) an deutsche FE-Werte angleichen - behebt 400-Fehler beim Speichern.</w:t>
             </w:r>
           </w:p>
         </w:tc>
@@ -1371,7 +1625,7 @@
           </w:tcPr>
           <w:p>
             <w:r>
-              <w:t xml:space="preserve">Hoch</w:t>
+              <w:t xml:space="preserve">Niedrig</w:t>
             </w:r>
           </w:p>
         </w:tc>
@@ -1393,7 +1647,7 @@
           </w:tcPr>
           <w:p>
             <w:r>
-              <w:t xml:space="preserve">Sicherheit</w:t>
+              <w:t xml:space="preserve">Funktion.</w:t>
             </w:r>
           </w:p>
         </w:tc>
@@ -1440,7 +1694,7 @@
           </w:tcPr>
           <w:p>
             <w:r>
-              <w:t xml:space="preserve">Upload-Limits: max. Dateigröße + MIME-Whitelist (Multer-limits + Prüfung).</w:t>
+              <w:t xml:space="preserve">Upload-Limits: max. Dateigroesse (Multer-limits) + MIME-Whitelist (PDF/JPEG/PNG) - verhindert OOM &amp; Stored-XSS.</w:t>
             </w:r>
           </w:p>
         </w:tc>
@@ -1531,7 +1785,7 @@
           </w:tcPr>
           <w:p>
             <w:r>
-              <w:t xml:space="preserve">HTTPS/TLS sicherstellen (Coolify-Domain + Zertifikat), Basic-Auth nie über HTTP.</w:t>
+              <w:t xml:space="preserve">Mobile Navigation reparieren: Sidebar per hidden lg:block ausblenden + Hamburger-Menue in Topbar.</w:t>
             </w:r>
           </w:p>
         </w:tc>
@@ -1575,7 +1829,7 @@
           </w:tcPr>
           <w:p>
             <w:r>
-              <w:t xml:space="preserve">Sicherheit</w:t>
+              <w:t xml:space="preserve">UX</w:t>
             </w:r>
           </w:p>
         </w:tc>
@@ -1622,7 +1876,7 @@
           </w:tcPr>
           <w:p>
             <w:r>
-              <w:t xml:space="preserve">Automatisiertes DB-Backup per Zeitplan (Coolify-Cron) + dokumentierter Restore-Test.</w:t>
+              <w:t xml:space="preserve">HTTPS/TLS ueber echte Domain (Coolify/Traefik/Caddy, Let's Encrypt); Basic-Auth nie ueber HTTP.</w:t>
             </w:r>
           </w:p>
         </w:tc>
@@ -1666,7 +1920,7 @@
           </w:tcPr>
           <w:p>
             <w:r>
-              <w:t xml:space="preserve">Datensicherheit</w:t>
+              <w:t xml:space="preserve">Sicherheit</w:t>
             </w:r>
           </w:p>
         </w:tc>
@@ -1681,17 +1935,17 @@
               <w:bottom w:val="single" w:color="CCCCCC" w:sz="1"/>
               <w:right w:val="single" w:color="CCCCCC" w:sz="1"/>
             </w:tcBorders>
-            <w:shd w:fill="FCF3CF" w:val="clear"/>
-            <w:tcMar>
-              <w:top w:type="dxa" w:w="60"/>
-              <w:left w:type="dxa" w:w="120"/>
-              <w:bottom w:type="dxa" w:w="60"/>
-              <w:right w:type="dxa" w:w="120"/>
-            </w:tcMar>
-          </w:tcPr>
-          <w:p>
-            <w:r>
-              <w:t xml:space="preserve">P1</w:t>
+            <w:shd w:fill="F5B7B1" w:val="clear"/>
+            <w:tcMar>
+              <w:top w:type="dxa" w:w="60"/>
+              <w:left w:type="dxa" w:w="120"/>
+              <w:bottom w:type="dxa" w:w="60"/>
+              <w:right w:type="dxa" w:w="120"/>
+            </w:tcMar>
+          </w:tcPr>
+          <w:p>
+            <w:r>
+              <w:t xml:space="preserve">P0</w:t>
             </w:r>
           </w:p>
         </w:tc>
@@ -1713,7 +1967,7 @@
           </w:tcPr>
           <w:p>
             <w:r>
-              <w:t xml:space="preserve">Mandanten-/Objekt-Autorisierung: tenantId/Owner an Datenmodelle, Query-Scoping pro Nutzer.</w:t>
+              <w:t xml:space="preserve">Automatisiertes DB-Backup per Zeitplan (Coolify-Cron) + dokumentierter Restore-Test.</w:t>
             </w:r>
           </w:p>
         </w:tc>
@@ -1735,7 +1989,7 @@
           </w:tcPr>
           <w:p>
             <w:r>
-              <w:t xml:space="preserve">Hoch</w:t>
+              <w:t xml:space="preserve">Niedrig</w:t>
             </w:r>
           </w:p>
         </w:tc>
@@ -1757,7 +2011,7 @@
           </w:tcPr>
           <w:p>
             <w:r>
-              <w:t xml:space="preserve">Sicherheit</w:t>
+              <w:t xml:space="preserve">Datensich.</w:t>
             </w:r>
           </w:p>
         </w:tc>
@@ -1804,7 +2058,7 @@
           </w:tcPr>
           <w:p>
             <w:r>
-              <w:t xml:space="preserve">Pagination + serverseitige Filter für Listen (Objekte, Mieter, Verträge, Dokumente).</w:t>
+              <w:t xml:space="preserve">Dokumentenliste entlasten: kein Datei-Check/URL pro Doc; Presigned-URL erst on-demand beim Download.</w:t>
             </w:r>
           </w:p>
         </w:tc>
@@ -1895,7 +2149,7 @@
           </w:tcPr>
           <w:p>
             <w:r>
-              <w:t xml:space="preserve">Health-Endpoint (@nestjs/terminus) + Healthchecks für API/Web in Compose.</w:t>
+              <w:t xml:space="preserve">Kampagnen-Anlage: Schleifen-Upserts durch Batch/Transaktion (createMany) ersetzen.</w:t>
             </w:r>
           </w:p>
         </w:tc>
@@ -1917,7 +2171,7 @@
           </w:tcPr>
           <w:p>
             <w:r>
-              <w:t xml:space="preserve">Niedrig</w:t>
+              <w:t xml:space="preserve">Mittel</w:t>
             </w:r>
           </w:p>
         </w:tc>
@@ -1939,7 +2193,7 @@
           </w:tcPr>
           <w:p>
             <w:r>
-              <w:t xml:space="preserve">Stabilität</w:t>
+              <w:t xml:space="preserve">Performance</w:t>
             </w:r>
           </w:p>
         </w:tc>
@@ -1986,7 +2240,7 @@
           </w:tcPr>
           <w:p>
             <w:r>
-              <w:t xml:space="preserve">Globaler Exception-Filter + strukturierte (JSON-)Logs mit Korrelations-ID.</w:t>
+              <w:t xml:space="preserve">Zod-Schemas in alle Formulare einbinden; Backend-Validierungsfehler im UI anzeigen.</w:t>
             </w:r>
           </w:p>
         </w:tc>
@@ -2030,7 +2284,7 @@
           </w:tcPr>
           <w:p>
             <w:r>
-              <w:t xml:space="preserve">Stabilität</w:t>
+              <w:t xml:space="preserve">Funkt./UX</w:t>
             </w:r>
           </w:p>
         </w:tc>
@@ -2077,7 +2331,7 @@
           </w:tcPr>
           <w:p>
             <w:r>
-              <w:t xml:space="preserve">CI härten: Tests + Lint als Pflicht-Gate vor Image-Build.</w:t>
+              <w:t xml:space="preserve">Pagination + serverseitige Filter fuer Listen (Objekte, Mieter, Vertraege, Dokumente).</w:t>
             </w:r>
           </w:p>
         </w:tc>
@@ -2099,7 +2353,7 @@
           </w:tcPr>
           <w:p>
             <w:r>
-              <w:t xml:space="preserve">Niedrig</w:t>
+              <w:t xml:space="preserve">Mittel</w:t>
             </w:r>
           </w:p>
         </w:tc>
@@ -2121,7 +2375,7 @@
           </w:tcPr>
           <w:p>
             <w:r>
-              <w:t xml:space="preserve">Funktionalität</w:t>
+              <w:t xml:space="preserve">Performance</w:t>
             </w:r>
           </w:p>
         </w:tc>
@@ -2136,17 +2390,17 @@
               <w:bottom w:val="single" w:color="CCCCCC" w:sz="1"/>
               <w:right w:val="single" w:color="CCCCCC" w:sz="1"/>
             </w:tcBorders>
-            <w:shd w:fill="D5F5E3" w:val="clear"/>
-            <w:tcMar>
-              <w:top w:type="dxa" w:w="60"/>
-              <w:left w:type="dxa" w:w="120"/>
-              <w:bottom w:type="dxa" w:w="60"/>
-              <w:right w:type="dxa" w:w="120"/>
-            </w:tcMar>
-          </w:tcPr>
-          <w:p>
-            <w:r>
-              <w:t xml:space="preserve">P2</w:t>
+            <w:shd w:fill="FCF3CF" w:val="clear"/>
+            <w:tcMar>
+              <w:top w:type="dxa" w:w="60"/>
+              <w:left w:type="dxa" w:w="120"/>
+              <w:bottom w:type="dxa" w:w="60"/>
+              <w:right w:type="dxa" w:w="120"/>
+            </w:tcMar>
+          </w:tcPr>
+          <w:p>
+            <w:r>
+              <w:t xml:space="preserve">P1</w:t>
             </w:r>
           </w:p>
         </w:tc>
@@ -2168,7 +2422,7 @@
           </w:tcPr>
           <w:p>
             <w:r>
-              <w:t xml:space="preserve">DTO-Validierung für Document-Endpunkte; Feld-Längenlimits (DB + Zod).</w:t>
+              <w:t xml:space="preserve">Health-Endpoint (@nestjs/terminus) + Healthchecks fuer API/Web; Uptime-Monitoring (Uptime Kuma).</w:t>
             </w:r>
           </w:p>
         </w:tc>
@@ -2212,7 +2466,7 @@
           </w:tcPr>
           <w:p>
             <w:r>
-              <w:t xml:space="preserve">Funktionalität</w:t>
+              <w:t xml:space="preserve">Stabilitaet</w:t>
             </w:r>
           </w:p>
         </w:tc>
@@ -2227,17 +2481,17 @@
               <w:bottom w:val="single" w:color="CCCCCC" w:sz="1"/>
               <w:right w:val="single" w:color="CCCCCC" w:sz="1"/>
             </w:tcBorders>
-            <w:shd w:fill="D5F5E3" w:val="clear"/>
-            <w:tcMar>
-              <w:top w:type="dxa" w:w="60"/>
-              <w:left w:type="dxa" w:w="120"/>
-              <w:bottom w:type="dxa" w:w="60"/>
-              <w:right w:type="dxa" w:w="120"/>
-            </w:tcMar>
-          </w:tcPr>
-          <w:p>
-            <w:r>
-              <w:t xml:space="preserve">P2</w:t>
+            <w:shd w:fill="FCF3CF" w:val="clear"/>
+            <w:tcMar>
+              <w:top w:type="dxa" w:w="60"/>
+              <w:left w:type="dxa" w:w="120"/>
+              <w:bottom w:type="dxa" w:w="60"/>
+              <w:right w:type="dxa" w:w="120"/>
+            </w:tcMar>
+          </w:tcPr>
+          <w:p>
+            <w:r>
+              <w:t xml:space="preserve">P1</w:t>
             </w:r>
           </w:p>
         </w:tc>
@@ -2259,7 +2513,7 @@
           </w:tcPr>
           <w:p>
             <w:r>
-              <w:t xml:space="preserve">Datei-Downloads über presigned S3-URLs statt API-Streaming.</w:t>
+              <w:t xml:space="preserve">Bildkomprimierung beim Upload (sharp - nachzuinstallieren): Skalierung + WebP/JPEG-Recompress.</w:t>
             </w:r>
           </w:p>
         </w:tc>
@@ -2318,17 +2572,17 @@
               <w:bottom w:val="single" w:color="CCCCCC" w:sz="1"/>
               <w:right w:val="single" w:color="CCCCCC" w:sz="1"/>
             </w:tcBorders>
-            <w:shd w:fill="D5F5E3" w:val="clear"/>
-            <w:tcMar>
-              <w:top w:type="dxa" w:w="60"/>
-              <w:left w:type="dxa" w:w="120"/>
-              <w:bottom w:type="dxa" w:w="60"/>
-              <w:right w:type="dxa" w:w="120"/>
-            </w:tcMar>
-          </w:tcPr>
-          <w:p>
-            <w:r>
-              <w:t xml:space="preserve">P2</w:t>
+            <w:shd w:fill="FCF3CF" w:val="clear"/>
+            <w:tcMar>
+              <w:top w:type="dxa" w:w="60"/>
+              <w:left w:type="dxa" w:w="120"/>
+              <w:bottom w:type="dxa" w:w="60"/>
+              <w:right w:type="dxa" w:w="120"/>
+            </w:tcMar>
+          </w:tcPr>
+          <w:p>
+            <w:r>
+              <w:t xml:space="preserve">P1</w:t>
             </w:r>
           </w:p>
         </w:tc>
@@ -2350,7 +2604,7 @@
           </w:tcPr>
           <w:p>
             <w:r>
-              <w:t xml:space="preserve">Mobile-Optimierung &amp; Ladezustände (Skeletons) für alle Listen/Formulare.</w:t>
+              <w:t xml:space="preserve">CI haerten: Tests + Lint als Pflicht-Gate vor Image-Build.</w:t>
             </w:r>
           </w:p>
         </w:tc>
@@ -2372,7 +2626,7 @@
           </w:tcPr>
           <w:p>
             <w:r>
-              <w:t xml:space="preserve">Mittel</w:t>
+              <w:t xml:space="preserve">Niedrig</w:t>
             </w:r>
           </w:p>
         </w:tc>
@@ -2394,7 +2648,7 @@
           </w:tcPr>
           <w:p>
             <w:r>
-              <w:t xml:space="preserve">UX</w:t>
+              <w:t xml:space="preserve">Funktion.</w:t>
             </w:r>
           </w:p>
         </w:tc>
@@ -2441,7 +2695,7 @@
           </w:tcPr>
           <w:p>
             <w:r>
-              <w:t xml:space="preserve">Spezifischere Fehlermeldungen im Frontend statt generischem Text.</w:t>
+              <w:t xml:space="preserve">Echtes Multi-Tenancy: tenantId an alle operativen Modelle + globaler Prisma-Scoping-Interceptor.</w:t>
             </w:r>
           </w:p>
         </w:tc>
@@ -2463,7 +2717,7 @@
           </w:tcPr>
           <w:p>
             <w:r>
-              <w:t xml:space="preserve">Niedrig</w:t>
+              <w:t xml:space="preserve">Hoch</w:t>
             </w:r>
           </w:p>
         </w:tc>
@@ -2485,7 +2739,462 @@
           </w:tcPr>
           <w:p>
             <w:r>
-              <w:t xml:space="preserve">UX</w:t>
+              <w:t xml:space="preserve">Sicherheit</w:t>
+            </w:r>
+          </w:p>
+        </w:tc>
+      </w:tr>
+      <w:tr>
+        <w:tc>
+          <w:tcPr>
+            <w:tcW w:type="dxa" w:w="820"/>
+            <w:tcBorders>
+              <w:top w:val="single" w:color="CCCCCC" w:sz="1"/>
+              <w:left w:val="single" w:color="CCCCCC" w:sz="1"/>
+              <w:bottom w:val="single" w:color="CCCCCC" w:sz="1"/>
+              <w:right w:val="single" w:color="CCCCCC" w:sz="1"/>
+            </w:tcBorders>
+            <w:shd w:fill="D5F5E3" w:val="clear"/>
+            <w:tcMar>
+              <w:top w:type="dxa" w:w="60"/>
+              <w:left w:type="dxa" w:w="120"/>
+              <w:bottom w:type="dxa" w:w="60"/>
+              <w:right w:type="dxa" w:w="120"/>
+            </w:tcMar>
+          </w:tcPr>
+          <w:p>
+            <w:r>
+              <w:t xml:space="preserve">P2</w:t>
+            </w:r>
+          </w:p>
+        </w:tc>
+        <w:tc>
+          <w:tcPr>
+            <w:tcW w:type="dxa" w:w="4706"/>
+            <w:tcBorders>
+              <w:top w:val="single" w:color="CCCCCC" w:sz="1"/>
+              <w:left w:val="single" w:color="CCCCCC" w:sz="1"/>
+              <w:bottom w:val="single" w:color="CCCCCC" w:sz="1"/>
+              <w:right w:val="single" w:color="CCCCCC" w:sz="1"/>
+            </w:tcBorders>
+            <w:tcMar>
+              <w:top w:type="dxa" w:w="60"/>
+              <w:left w:type="dxa" w:w="120"/>
+              <w:bottom w:type="dxa" w:w="60"/>
+              <w:right w:type="dxa" w:w="120"/>
+            </w:tcMar>
+          </w:tcPr>
+          <w:p>
+            <w:r>
+              <w:t xml:space="preserve">Entra-ID-Frontend-Login (@azure/msal-react) -&gt; echte Bearer-Tokens, AUTH_MODE=entra in Produktion.</w:t>
+            </w:r>
+          </w:p>
+        </w:tc>
+        <w:tc>
+          <w:tcPr>
+            <w:tcW w:type="dxa" w:w="1300"/>
+            <w:tcBorders>
+              <w:top w:val="single" w:color="CCCCCC" w:sz="1"/>
+              <w:left w:val="single" w:color="CCCCCC" w:sz="1"/>
+              <w:bottom w:val="single" w:color="CCCCCC" w:sz="1"/>
+              <w:right w:val="single" w:color="CCCCCC" w:sz="1"/>
+            </w:tcBorders>
+            <w:tcMar>
+              <w:top w:type="dxa" w:w="60"/>
+              <w:left w:type="dxa" w:w="120"/>
+              <w:bottom w:type="dxa" w:w="60"/>
+              <w:right w:type="dxa" w:w="120"/>
+            </w:tcMar>
+          </w:tcPr>
+          <w:p>
+            <w:r>
+              <w:t xml:space="preserve">Hoch</w:t>
+            </w:r>
+          </w:p>
+        </w:tc>
+        <w:tc>
+          <w:tcPr>
+            <w:tcW w:type="dxa" w:w="2200"/>
+            <w:tcBorders>
+              <w:top w:val="single" w:color="CCCCCC" w:sz="1"/>
+              <w:left w:val="single" w:color="CCCCCC" w:sz="1"/>
+              <w:bottom w:val="single" w:color="CCCCCC" w:sz="1"/>
+              <w:right w:val="single" w:color="CCCCCC" w:sz="1"/>
+            </w:tcBorders>
+            <w:tcMar>
+              <w:top w:type="dxa" w:w="60"/>
+              <w:left w:type="dxa" w:w="120"/>
+              <w:bottom w:type="dxa" w:w="60"/>
+              <w:right w:type="dxa" w:w="120"/>
+            </w:tcMar>
+          </w:tcPr>
+          <w:p>
+            <w:r>
+              <w:t xml:space="preserve">Sicherheit</w:t>
+            </w:r>
+          </w:p>
+        </w:tc>
+      </w:tr>
+      <w:tr>
+        <w:tc>
+          <w:tcPr>
+            <w:tcW w:type="dxa" w:w="820"/>
+            <w:tcBorders>
+              <w:top w:val="single" w:color="CCCCCC" w:sz="1"/>
+              <w:left w:val="single" w:color="CCCCCC" w:sz="1"/>
+              <w:bottom w:val="single" w:color="CCCCCC" w:sz="1"/>
+              <w:right w:val="single" w:color="CCCCCC" w:sz="1"/>
+            </w:tcBorders>
+            <w:shd w:fill="D5F5E3" w:val="clear"/>
+            <w:tcMar>
+              <w:top w:type="dxa" w:w="60"/>
+              <w:left w:type="dxa" w:w="120"/>
+              <w:bottom w:type="dxa" w:w="60"/>
+              <w:right w:type="dxa" w:w="120"/>
+            </w:tcMar>
+          </w:tcPr>
+          <w:p>
+            <w:r>
+              <w:t xml:space="preserve">P2</w:t>
+            </w:r>
+          </w:p>
+        </w:tc>
+        <w:tc>
+          <w:tcPr>
+            <w:tcW w:type="dxa" w:w="4706"/>
+            <w:tcBorders>
+              <w:top w:val="single" w:color="CCCCCC" w:sz="1"/>
+              <w:left w:val="single" w:color="CCCCCC" w:sz="1"/>
+              <w:bottom w:val="single" w:color="CCCCCC" w:sz="1"/>
+              <w:right w:val="single" w:color="CCCCCC" w:sz="1"/>
+            </w:tcBorders>
+            <w:tcMar>
+              <w:top w:type="dxa" w:w="60"/>
+              <w:left w:type="dxa" w:w="120"/>
+              <w:bottom w:type="dxa" w:w="60"/>
+              <w:right w:type="dxa" w:w="120"/>
+            </w:tcMar>
+          </w:tcPr>
+          <w:p>
+            <w:r>
+              <w:t xml:space="preserve">Datum als DateTime statt String speichern; ISO-Konsistenz ueber Seeds/DB/DTO.</w:t>
+            </w:r>
+          </w:p>
+        </w:tc>
+        <w:tc>
+          <w:tcPr>
+            <w:tcW w:type="dxa" w:w="1300"/>
+            <w:tcBorders>
+              <w:top w:val="single" w:color="CCCCCC" w:sz="1"/>
+              <w:left w:val="single" w:color="CCCCCC" w:sz="1"/>
+              <w:bottom w:val="single" w:color="CCCCCC" w:sz="1"/>
+              <w:right w:val="single" w:color="CCCCCC" w:sz="1"/>
+            </w:tcBorders>
+            <w:tcMar>
+              <w:top w:type="dxa" w:w="60"/>
+              <w:left w:type="dxa" w:w="120"/>
+              <w:bottom w:type="dxa" w:w="60"/>
+              <w:right w:type="dxa" w:w="120"/>
+            </w:tcMar>
+          </w:tcPr>
+          <w:p>
+            <w:r>
+              <w:t xml:space="preserve">Mittel</w:t>
+            </w:r>
+          </w:p>
+        </w:tc>
+        <w:tc>
+          <w:tcPr>
+            <w:tcW w:type="dxa" w:w="2200"/>
+            <w:tcBorders>
+              <w:top w:val="single" w:color="CCCCCC" w:sz="1"/>
+              <w:left w:val="single" w:color="CCCCCC" w:sz="1"/>
+              <w:bottom w:val="single" w:color="CCCCCC" w:sz="1"/>
+              <w:right w:val="single" w:color="CCCCCC" w:sz="1"/>
+            </w:tcBorders>
+            <w:tcMar>
+              <w:top w:type="dxa" w:w="60"/>
+              <w:left w:type="dxa" w:w="120"/>
+              <w:bottom w:type="dxa" w:w="60"/>
+              <w:right w:type="dxa" w:w="120"/>
+            </w:tcMar>
+          </w:tcPr>
+          <w:p>
+            <w:r>
+              <w:t xml:space="preserve">Funktion.</w:t>
+            </w:r>
+          </w:p>
+        </w:tc>
+      </w:tr>
+      <w:tr>
+        <w:tc>
+          <w:tcPr>
+            <w:tcW w:type="dxa" w:w="820"/>
+            <w:tcBorders>
+              <w:top w:val="single" w:color="CCCCCC" w:sz="1"/>
+              <w:left w:val="single" w:color="CCCCCC" w:sz="1"/>
+              <w:bottom w:val="single" w:color="CCCCCC" w:sz="1"/>
+              <w:right w:val="single" w:color="CCCCCC" w:sz="1"/>
+            </w:tcBorders>
+            <w:shd w:fill="D5F5E3" w:val="clear"/>
+            <w:tcMar>
+              <w:top w:type="dxa" w:w="60"/>
+              <w:left w:type="dxa" w:w="120"/>
+              <w:bottom w:type="dxa" w:w="60"/>
+              <w:right w:type="dxa" w:w="120"/>
+            </w:tcMar>
+          </w:tcPr>
+          <w:p>
+            <w:r>
+              <w:t xml:space="preserve">P2</w:t>
+            </w:r>
+          </w:p>
+        </w:tc>
+        <w:tc>
+          <w:tcPr>
+            <w:tcW w:type="dxa" w:w="4706"/>
+            <w:tcBorders>
+              <w:top w:val="single" w:color="CCCCCC" w:sz="1"/>
+              <w:left w:val="single" w:color="CCCCCC" w:sz="1"/>
+              <w:bottom w:val="single" w:color="CCCCCC" w:sz="1"/>
+              <w:right w:val="single" w:color="CCCCCC" w:sz="1"/>
+            </w:tcBorders>
+            <w:tcMar>
+              <w:top w:type="dxa" w:w="60"/>
+              <w:left w:type="dxa" w:w="120"/>
+              <w:bottom w:type="dxa" w:w="60"/>
+              <w:right w:type="dxa" w:w="120"/>
+            </w:tcMar>
+          </w:tcPr>
+          <w:p>
+            <w:r>
+              <w:t xml:space="preserve">Nebenkosten-Persistenz vollstaendig auf API umstellen (localStorage nur Notfall-Fallback).</w:t>
+            </w:r>
+          </w:p>
+        </w:tc>
+        <w:tc>
+          <w:tcPr>
+            <w:tcW w:type="dxa" w:w="1300"/>
+            <w:tcBorders>
+              <w:top w:val="single" w:color="CCCCCC" w:sz="1"/>
+              <w:left w:val="single" w:color="CCCCCC" w:sz="1"/>
+              <w:bottom w:val="single" w:color="CCCCCC" w:sz="1"/>
+              <w:right w:val="single" w:color="CCCCCC" w:sz="1"/>
+            </w:tcBorders>
+            <w:tcMar>
+              <w:top w:type="dxa" w:w="60"/>
+              <w:left w:type="dxa" w:w="120"/>
+              <w:bottom w:type="dxa" w:w="60"/>
+              <w:right w:type="dxa" w:w="120"/>
+            </w:tcMar>
+          </w:tcPr>
+          <w:p>
+            <w:r>
+              <w:t xml:space="preserve">Mittel</w:t>
+            </w:r>
+          </w:p>
+        </w:tc>
+        <w:tc>
+          <w:tcPr>
+            <w:tcW w:type="dxa" w:w="2200"/>
+            <w:tcBorders>
+              <w:top w:val="single" w:color="CCCCCC" w:sz="1"/>
+              <w:left w:val="single" w:color="CCCCCC" w:sz="1"/>
+              <w:bottom w:val="single" w:color="CCCCCC" w:sz="1"/>
+              <w:right w:val="single" w:color="CCCCCC" w:sz="1"/>
+            </w:tcBorders>
+            <w:tcMar>
+              <w:top w:type="dxa" w:w="60"/>
+              <w:left w:type="dxa" w:w="120"/>
+              <w:bottom w:type="dxa" w:w="60"/>
+              <w:right w:type="dxa" w:w="120"/>
+            </w:tcMar>
+          </w:tcPr>
+          <w:p>
+            <w:r>
+              <w:t xml:space="preserve">Funktion.</w:t>
+            </w:r>
+          </w:p>
+        </w:tc>
+      </w:tr>
+      <w:tr>
+        <w:tc>
+          <w:tcPr>
+            <w:tcW w:type="dxa" w:w="820"/>
+            <w:tcBorders>
+              <w:top w:val="single" w:color="CCCCCC" w:sz="1"/>
+              <w:left w:val="single" w:color="CCCCCC" w:sz="1"/>
+              <w:bottom w:val="single" w:color="CCCCCC" w:sz="1"/>
+              <w:right w:val="single" w:color="CCCCCC" w:sz="1"/>
+            </w:tcBorders>
+            <w:shd w:fill="D5F5E3" w:val="clear"/>
+            <w:tcMar>
+              <w:top w:type="dxa" w:w="60"/>
+              <w:left w:type="dxa" w:w="120"/>
+              <w:bottom w:type="dxa" w:w="60"/>
+              <w:right w:type="dxa" w:w="120"/>
+            </w:tcMar>
+          </w:tcPr>
+          <w:p>
+            <w:r>
+              <w:t xml:space="preserve">P2</w:t>
+            </w:r>
+          </w:p>
+        </w:tc>
+        <w:tc>
+          <w:tcPr>
+            <w:tcW w:type="dxa" w:w="4706"/>
+            <w:tcBorders>
+              <w:top w:val="single" w:color="CCCCCC" w:sz="1"/>
+              <w:left w:val="single" w:color="CCCCCC" w:sz="1"/>
+              <w:bottom w:val="single" w:color="CCCCCC" w:sz="1"/>
+              <w:right w:val="single" w:color="CCCCCC" w:sz="1"/>
+            </w:tcBorders>
+            <w:tcMar>
+              <w:top w:type="dxa" w:w="60"/>
+              <w:left w:type="dxa" w:w="120"/>
+              <w:bottom w:type="dxa" w:w="60"/>
+              <w:right w:type="dxa" w:w="120"/>
+            </w:tcMar>
+          </w:tcPr>
+          <w:p>
+            <w:r>
+              <w:t xml:space="preserve">Strukturierte (JSON-)Logs via Pino mit Korrelations-ID; globaler Exception-Filter.</w:t>
+            </w:r>
+          </w:p>
+        </w:tc>
+        <w:tc>
+          <w:tcPr>
+            <w:tcW w:type="dxa" w:w="1300"/>
+            <w:tcBorders>
+              <w:top w:val="single" w:color="CCCCCC" w:sz="1"/>
+              <w:left w:val="single" w:color="CCCCCC" w:sz="1"/>
+              <w:bottom w:val="single" w:color="CCCCCC" w:sz="1"/>
+              <w:right w:val="single" w:color="CCCCCC" w:sz="1"/>
+            </w:tcBorders>
+            <w:tcMar>
+              <w:top w:type="dxa" w:w="60"/>
+              <w:left w:type="dxa" w:w="120"/>
+              <w:bottom w:type="dxa" w:w="60"/>
+              <w:right w:type="dxa" w:w="120"/>
+            </w:tcMar>
+          </w:tcPr>
+          <w:p>
+            <w:r>
+              <w:t xml:space="preserve">Mittel</w:t>
+            </w:r>
+          </w:p>
+        </w:tc>
+        <w:tc>
+          <w:tcPr>
+            <w:tcW w:type="dxa" w:w="2200"/>
+            <w:tcBorders>
+              <w:top w:val="single" w:color="CCCCCC" w:sz="1"/>
+              <w:left w:val="single" w:color="CCCCCC" w:sz="1"/>
+              <w:bottom w:val="single" w:color="CCCCCC" w:sz="1"/>
+              <w:right w:val="single" w:color="CCCCCC" w:sz="1"/>
+            </w:tcBorders>
+            <w:tcMar>
+              <w:top w:type="dxa" w:w="60"/>
+              <w:left w:type="dxa" w:w="120"/>
+              <w:bottom w:type="dxa" w:w="60"/>
+              <w:right w:type="dxa" w:w="120"/>
+            </w:tcMar>
+          </w:tcPr>
+          <w:p>
+            <w:r>
+              <w:t xml:space="preserve">Stabilitaet</w:t>
+            </w:r>
+          </w:p>
+        </w:tc>
+      </w:tr>
+      <w:tr>
+        <w:tc>
+          <w:tcPr>
+            <w:tcW w:type="dxa" w:w="820"/>
+            <w:tcBorders>
+              <w:top w:val="single" w:color="CCCCCC" w:sz="1"/>
+              <w:left w:val="single" w:color="CCCCCC" w:sz="1"/>
+              <w:bottom w:val="single" w:color="CCCCCC" w:sz="1"/>
+              <w:right w:val="single" w:color="CCCCCC" w:sz="1"/>
+            </w:tcBorders>
+            <w:shd w:fill="D5F5E3" w:val="clear"/>
+            <w:tcMar>
+              <w:top w:type="dxa" w:w="60"/>
+              <w:left w:type="dxa" w:w="120"/>
+              <w:bottom w:type="dxa" w:w="60"/>
+              <w:right w:type="dxa" w:w="120"/>
+            </w:tcMar>
+          </w:tcPr>
+          <w:p>
+            <w:r>
+              <w:t xml:space="preserve">P2</w:t>
+            </w:r>
+          </w:p>
+        </w:tc>
+        <w:tc>
+          <w:tcPr>
+            <w:tcW w:type="dxa" w:w="4706"/>
+            <w:tcBorders>
+              <w:top w:val="single" w:color="CCCCCC" w:sz="1"/>
+              <w:left w:val="single" w:color="CCCCCC" w:sz="1"/>
+              <w:bottom w:val="single" w:color="CCCCCC" w:sz="1"/>
+              <w:right w:val="single" w:color="CCCCCC" w:sz="1"/>
+            </w:tcBorders>
+            <w:tcMar>
+              <w:top w:type="dxa" w:w="60"/>
+              <w:left w:type="dxa" w:w="120"/>
+              <w:bottom w:type="dxa" w:w="60"/>
+              <w:right w:type="dxa" w:w="120"/>
+            </w:tcMar>
+          </w:tcPr>
+          <w:p>
+            <w:r>
+              <w:t xml:space="preserve">DSGVO: Verschluesselung/Anonymisierung/Loeschkonzept fuer Mieterdaten nach Vertragsende.</w:t>
+            </w:r>
+          </w:p>
+        </w:tc>
+        <w:tc>
+          <w:tcPr>
+            <w:tcW w:type="dxa" w:w="1300"/>
+            <w:tcBorders>
+              <w:top w:val="single" w:color="CCCCCC" w:sz="1"/>
+              <w:left w:val="single" w:color="CCCCCC" w:sz="1"/>
+              <w:bottom w:val="single" w:color="CCCCCC" w:sz="1"/>
+              <w:right w:val="single" w:color="CCCCCC" w:sz="1"/>
+            </w:tcBorders>
+            <w:tcMar>
+              <w:top w:type="dxa" w:w="60"/>
+              <w:left w:type="dxa" w:w="120"/>
+              <w:bottom w:type="dxa" w:w="60"/>
+              <w:right w:type="dxa" w:w="120"/>
+            </w:tcMar>
+          </w:tcPr>
+          <w:p>
+            <w:r>
+              <w:t xml:space="preserve">Mittel</w:t>
+            </w:r>
+          </w:p>
+        </w:tc>
+        <w:tc>
+          <w:tcPr>
+            <w:tcW w:type="dxa" w:w="2200"/>
+            <w:tcBorders>
+              <w:top w:val="single" w:color="CCCCCC" w:sz="1"/>
+              <w:left w:val="single" w:color="CCCCCC" w:sz="1"/>
+              <w:bottom w:val="single" w:color="CCCCCC" w:sz="1"/>
+              <w:right w:val="single" w:color="CCCCCC" w:sz="1"/>
+            </w:tcBorders>
+            <w:tcMar>
+              <w:top w:type="dxa" w:w="60"/>
+              <w:left w:type="dxa" w:w="120"/>
+              <w:bottom w:type="dxa" w:w="60"/>
+              <w:right w:type="dxa" w:w="120"/>
+            </w:tcMar>
+          </w:tcPr>
+          <w:p>
+            <w:r>
+              <w:t xml:space="preserve">Datensich.</w:t>
             </w:r>
           </w:p>
         </w:tc>
@@ -2493,25 +3202,10 @@
     </w:tbl>
     <w:p>
       <w:pPr>
-        <w:spacing w:before="120"/>
-      </w:pPr>
-      <w:r>
-        <w:rPr>
-          <w:i/>
-          <w:iCs/>
-          <w:color w:val="888888"/>
-          <w:sz w:val="16"/>
-          <w:szCs w:val="16"/>
-        </w:rPr>
-        <w:t xml:space="preserve">Hinweis: Aufwandsangaben sind grobe Schätzungen für einen einzelnen Entwickler.</w:t>
-      </w:r>
-    </w:p>
-    <w:p>
-      <w:pPr>
         <w:pStyle w:val="Heading1"/>
       </w:pPr>
       <w:r>
-        <w:t xml:space="preserve">4. Empfohlene nächste Schritte</w:t>
+        <w:t xml:space="preserve">5. Empfohlene Sofort-Schritte</w:t>
       </w:r>
     </w:p>
     <w:p>
@@ -2528,10 +3222,10 @@
           <w:b/>
           <w:bCs/>
         </w:rPr>
-        <w:t xml:space="preserve">Sofort:</w:t>
-      </w:r>
-      <w:r>
-        <w:t xml:space="preserve"> Upload-Limits, automatisiertes Backup mit Zeitplan und TLS-Absicherung umsetzen – geringer Aufwand, hohe Wirkung.</w:t>
+        <w:t xml:space="preserve">Quick Wins (gering, hohe Wirkung):</w:t>
+      </w:r>
+      <w:r>
+        <w:t xml:space="preserve"> Status-Enums angleichen, Upload-Limits, Sidebar mobil ausblenden, TLS-Domain, Backup-Zeitplan.</w:t>
       </w:r>
     </w:p>
     <w:p>
@@ -2548,10 +3242,10 @@
           <w:b/>
           <w:bCs/>
         </w:rPr>
-        <w:t xml:space="preserve">Als Projekt:</w:t>
-      </w:r>
-      <w:r>
-        <w:t xml:space="preserve"> App-Authentifizierung schließen (Frontend-Token + entra in Produktion) und Daten-Autorisierung pro Nutzer/Mandant einführen.</w:t>
+        <w:t xml:space="preserve">Danach:</w:t>
+      </w:r>
+      <w:r>
+        <w:t xml:space="preserve"> N+1 in Dokumentenliste &amp; Kampagnen-Anlage entschaerfen, Zod-Validierung + verstaendliche Fehlermeldungen, Pagination, Health-Check/Monitoring.</w:t>
       </w:r>
     </w:p>
     <w:p>
@@ -2568,10 +3262,10 @@
           <w:b/>
           <w:bCs/>
         </w:rPr>
-        <w:t xml:space="preserve">Begleitend:</w:t>
-      </w:r>
-      <w:r>
-        <w:t xml:space="preserve"> Pagination, Health-Checks und ein CI-Test-Gate als Fundament für stabilen Weiterbetrieb.</w:t>
+        <w:t xml:space="preserve">Als Architektur-Projekt:</w:t>
+      </w:r>
+      <w:r>
+        <w:t xml:space="preserve"> Multi-Tenancy (tenantId + Scoping-Interceptor) und Entra-Frontend-Login; danach AUTH_MODE=entra in Produktion.</w:t>
       </w:r>
     </w:p>
     <w:sectPr>
@@ -2638,7 +3332,7 @@
         <w:sz w:val="16"/>
         <w:szCs w:val="16"/>
       </w:rPr>
-      <w:t xml:space="preserve">Immologik – App-Check  ·  Seite </w:t>
+      <w:t xml:space="preserve">Immologik - App-Check v2 (konsolidiert) - Seite </w:t>
     </w:r>
     <w:r>
       <w:rPr>
@@ -2787,15 +3481,6 @@
       <w:lvlJc w:val="left"/>
       <w:pPr>
         <w:ind w:left="480" w:hanging="240"/>
-      </w:pPr>
-    </w:lvl>
-    <w:lvl w:ilvl="1" w15:tentative="1">
-      <w:start w:val="1"/>
-      <w:numFmt w:val="bullet"/>
-      <w:lvlText w:val="–"/>
-      <w:lvlJc w:val="left"/>
-      <w:pPr>
-        <w:ind w:left="960" w:hanging="240"/>
       </w:pPr>
     </w:lvl>
   </w:abstractNum>

</xml_diff>